<commit_message>
Condense report to preserve four-page limit
</commit_message>
<xml_diff>
--- a/report/CA6124_CDAE_Technical_Report.docx
+++ b/report/CA6124_CDAE_Technical_Report.docx
@@ -58,18 +58,7 @@
         <w:rPr>
           <w:rFonts w:ascii="Arial" w:hAnsi="Arial" w:eastAsia="Arial" w:cs="Arial"/>
         </w:rPr>
-        <w:t>This project integrates Collaborative Denoising Auto-Encoder (CDAE) [1], an established top-N method absent from the supplied DaisyRec 2.0 framework, and compares it with two existing baselines: the closed-form linear EASE model [2] and probabilistic Multi-VAE [3]. The research question is: under one reproducible warm-start full-ranking protocol, how does CDAE compare with a shallow item-co-occurrence model and a variational neural model on a dense movie dataset and a sparse e-commerce dataset?</w:t>
-      </w:r>
-    </w:p>
-    <w:p>
-      <w:pPr>
-        <w:spacing w:after="60" w:line="240" w:lineRule="auto"/>
-      </w:pPr>
-      <w:r>
-        <w:rPr>
-          <w:rFonts w:ascii="Arial" w:hAnsi="Arial" w:eastAsia="Arial" w:cs="Arial"/>
-        </w:rPr>
-        <w:t>MovieLens 1M and the 2014 Amazon Digital Music ratings-only release were selected to create a meaningful cross-domain stress test. Their differences jointly involve domain, scale, sparsity and temporal coverage; therefore observed performance differences are described as dataset-specific trends, not attributed causally to sparsity alone.</w:t>
+        <w:t>This project integrates Collaborative Denoising Auto-Encoder (CDAE) [1] into DaisyRec 2.0 and compares it with its EASE [2] and Multi-VAE [3] baselines under one reproducible warm-start full-ranking protocol. MovieLens 1M and the 2014 Amazon Digital Music ratings-only release provide dense movie and sparse e-commerce settings. Because they also differ in domain, scale and temporal coverage, results are interpreted as dataset-specific trends rather than causal effects of sparsity.</w:t>
       </w:r>
     </w:p>
     <w:p>
@@ -552,7 +541,7 @@
         <w:rPr>
           <w:rFonts w:ascii="Arial" w:hAnsi="Arial" w:eastAsia="Arial" w:cs="Arial"/>
         </w:rPr>
-        <w:t>Before seeing model results, the filter rule was fixed: use DaisyRec's one-pass 10filter unless fewer than 500 warm-start test users remain. Both datasets exceed the threshold, so 10filter is retained. Amazon 5filter was rejected because 20,356 items imply a 3.09 GiB float64 item matrix before EASE's additional inverse/storage costs. The 2014 Amazon file contains 836,006 headerless rows before filtering; its SHA-256 is documented in README.</w:t>
+        <w:t>The rule was fixed before modelling: retain DaisyRec's one-pass 10filter unless fewer than 500 warm-start test users remain. Both datasets pass. Amazon 5filter was rejected because 20,356 items require a 3.09 GiB float64 item matrix before EASE's inverse/storage overhead. The original Amazon file has 836,006 headerless rows; its SHA-256 is recorded in README.</w:t>
       </w:r>
     </w:p>
     <w:p>
@@ -603,7 +592,7 @@
         <w:rPr>
           <w:rFonts w:ascii="Arial" w:hAnsi="Arial" w:eastAsia="Arial" w:cs="Arial"/>
         </w:rPr>
-        <w:t>For user u with binary history xᵤ, CDAE applies training-only dropout to obtain x̃ᵤ and computes hᵤ = ReLU(W₁x̃ᵤ + vᵤ + b₁), where vᵤ is a learned user embedding. Decoder logits are zᵤ = W₂hᵤ + b₂. Training minimizes full-history summed binary cross-entropy plus optional L1/L2 penalties. Calling eval() disables corruption, so inference is deterministic. Relative to the original paper's sigmoid/tanh variants and discussion of negative sampling [1], ReLU and full-history BCE are deliberate framework-integration choices, not accidental substitutions.</w:t>
+        <w:t>For binary history xᵤ, CDAE applies training-only dropout and computes hᵤ = ReLU(W₁x̃ᵤ + vᵤ + b₁), where vᵤ is a user embedding; decoder logits are zᵤ = W₂hᵤ + b₂. Training uses full-history binary cross-entropy with optional L1/L2 penalties, while eval() disables corruption. ReLU and full-history BCE, rather than the original paper's sigmoid/tanh and negative-sampling variants [1], are deliberate DaisyRec integration choices.</w:t>
       </w:r>
     </w:p>
     <w:p>
@@ -614,7 +603,7 @@
         <w:rPr>
           <w:rFonts w:ascii="Arial" w:hAnsi="Arial" w:eastAsia="Arial" w:cs="Arial"/>
         </w:rPr>
-        <w:t>The implementation subclasses AERecommender and reuses DaisyRec history matrices, optimizer, device handling and training loop. Evaluation changes are opt-in configuration branches: split_boundary=day, warm_start=True, ranking_mode=full, optimization_k=10 and save_user_metrics=True. Defaults preserve DaisyRec's original interaction-boundary, unfiltered and sampled-candidate behaviour. Existing EASE and Multi-VAE model code is not replaced. Seven regression tests verify defaults and the added split, filtering, ranking, CDAE-inference, tuning and per-user-metric paths.</w:t>
+        <w:t>CDAE subclasses AERecommender and reuses DaisyRec's data, optimizer, device and training utilities. The added evaluation options - day split, warm start, full ranking, NDCG@10 tuning and per-user metrics - are opt-in; defaults and existing baselines remain unchanged. Seven regression tests cover the original defaults and all new paths.</w:t>
       </w:r>
     </w:p>
     <w:p>
@@ -636,7 +625,7 @@
         <w:rPr>
           <w:rFonts w:ascii="Arial" w:hAnsi="Arial" w:eastAsia="Arial" w:cs="Arial"/>
         </w:rPr>
-        <w:t>Ratings are converted to implicit interactions and duplicate user-item pairs are removed. A deterministic global timestamp boundary between complete calendar days is chosen nearest 80/20; ties are resolved deterministically. All events on one day stay on one side, important because Amazon timestamps have day precision. The actual train ratios are reported in Table 1 rather than claimed to be exactly 0.8.</w:t>
+        <w:t>Ratings become implicit interactions after duplicate user-item removal. A deterministic boundary between complete calendar days is chosen nearest 80/20, keeping equal-date Amazon events together; Table 1 reports the resulting ratios.</w:t>
       </w:r>
     </w:p>
     <w:p>
@@ -647,7 +636,7 @@
         <w:rPr>
           <w:rFonts w:ascii="Arial" w:hAnsi="Arial" w:eastAsia="Arial" w:cs="Arial"/>
         </w:rPr>
-        <w:t>Final evaluation keeps only test interactions whose user and item both occur in the 80% training set. Tuning applies the same rule relative to each training/validation split, so its evaluable item set is intentionally based on the smaller tuning-training subset. Ranking considers every training-seen item and masks the user's training positives. The final cohort is 1,152 ML-1M users / 105,699 interactions and 1,294 Amazon users / 4,065 interactions.</w:t>
+        <w:t>Warm-start evaluation retains test users/items seen in training; tuning applies the same rule to its smaller training subset. Full ranking scores every training-seen item and masks prior positives. Final cohorts contain 1,152 ML-1M users / 105,699 interactions and 1,294 Amazon users / 4,065 interactions.</w:t>
       </w:r>
     </w:p>
     <w:p>
@@ -658,18 +647,7 @@
         <w:rPr>
           <w:rFonts w:ascii="Arial" w:hAnsi="Arial" w:eastAsia="Arial" w:cs="Arial"/>
         </w:rPr>
-        <w:t>All tuning uses DaisyRec's supplied tune.py, whose existing backend is Optuna with a seeded TPE sampler (seed 2022). Each of the six groups receives 20 trials optimizing validation NDCG@10. The winner is retrained on the complete training partition and the untouched test set is evaluated once at K ∈ {1,5,10,20,30,50}. The uniform budget was fixed before final testing and all trial histories are retained.</w:t>
-      </w:r>
-    </w:p>
-    <w:p>
-      <w:pPr>
-        <w:spacing w:after="60" w:line="240" w:lineRule="auto"/>
-      </w:pPr>
-      <w:r>
-        <w:rPr>
-          <w:rFonts w:ascii="Arial" w:hAnsi="Arial" w:eastAsia="Arial" w:cs="Arial"/>
-        </w:rPr>
-        <w:t>CDAE and Multi-VAE use Adam for a fixed 50 epochs with early stopping disabled, giving equal epoch budgets. CDAE minimizes summed binary cross-entropy plus tuned L1/L2 penalties. Multi-VAE minimizes multinomial reconstruction loss (softmax cross-entropy) plus KL divergence. Its annealing counter advances per mini-batch; total_anneal_steps=400 makes every searched cap (0.05-0.5) reachable within 50 epochs. EASE is solved in closed form and has no epoch or optimizer.</w:t>
+        <w:t>DaisyRec's tune.py (Optuna TPE, seed 2022) runs 20 trials per group on validation NDCG@10. Winners are retrained and tested once at K ∈ {1,5,10,20,30,50}. CDAE and Multi-VAE use Adam for 50 epochs without early stopping; their losses are BCE+L1/L2 and multinomial+KL, respectively. Multi-VAE anneals per mini-batch over 400 steps, so every searched cap is reached. EASE is closed-form.</w:t>
       </w:r>
     </w:p>
     <w:p>
@@ -1456,18 +1434,7 @@
         <w:rPr>
           <w:rFonts w:ascii="Arial" w:hAnsi="Arial" w:eastAsia="Arial" w:cs="Arial"/>
         </w:rPr>
-        <w:t>The ranges were broadened before final testing, but residual upper-bound optima remain on Amazon: Multi-VAE selects d=512 and anneal=0.5, while CDAE selects d=256. Zero regularization is a natural lower bound, but these upper-bound selections are only the best tested settings, not proven global optima; a wider targeted search remains a limitation. With the practical KL schedule and equal 50-epoch budget, ML-1M Multi-VAE instead selects interior d=256 and anneal=0.1.</w:t>
-      </w:r>
-    </w:p>
-    <w:p>
-      <w:pPr>
-        <w:spacing w:after="60" w:line="240" w:lineRule="auto"/>
-      </w:pPr>
-      <w:r>
-        <w:rPr>
-          <w:rFonts w:ascii="Arial" w:hAnsi="Arial" w:eastAsia="Arial" w:cs="Arial"/>
-        </w:rPr>
-        <w:t>Tuning stability differs sharply. On Amazon, 8/20 Multi-VAE trials and 10/20 CDAE trials score below 0.01 NDCG@10 (4 and 8, respectively, below 0.005), whereas EASE stays within 0.0276-0.0358. No ML-1M trial falls below 0.01. Thus the neural models are much more hyperparameter-sensitive on this sparse cohort, while EASE's one-dimensional search is stable; the low scores are near-failure configurations, not software crashes.</w:t>
+        <w:t>Amazon retains upper-bound optima (Multi-VAE d=512, anneal=0.5; CDAE d=256), so they are best tested settings rather than proven global optima; ML-1M Multi-VAE selects interior d=256 and anneal=0.1. Amazon is also less stable: 8/20 Multi-VAE and 10/20 CDAE trials fall below 0.01 NDCG@10 (4 and 8 below 0.005), while EASE remains within 0.0276-0.0358 and no ML-1M trial falls below 0.01.</w:t>
       </w:r>
     </w:p>
     <w:p>
@@ -2083,7 +2050,7 @@
         <w:rPr>
           <w:rFonts w:ascii="Arial" w:hAnsi="Arial" w:eastAsia="Arial" w:cs="Arial"/>
         </w:rPr>
-        <w:t>On ML-1M, CDAE has the highest NDCG@10 (0.4992), narrowly ahead of Multi-VAE (0.4980), while Multi-VAE has the highest Recall@10 (0.0459 versus CDAE's 0.0433). The paired CDAE-Multi-VAE NDCG difference is only 0.00120; its 10,000-resample paired-bootstrap 95% CI [-0.0111, 0.0136] crosses zero. Both neural models reliably exceed EASE in NDCG, whose pairwise intervals exclude zero. Metric choice therefore changes the top model. Their ML-1M Hit Ratio curves are also close and rank Multi-VAE first at K=10, so HR is less discriminative than NDCG here.</w:t>
+        <w:t>On ML-1M, CDAE has the highest NDCG@10 (0.4992), but Multi-VAE leads Recall@10 (0.0459 versus 0.0433). Their paired NDCG difference is only 0.00120 and its 10,000-resample 95% CI [-0.0111, 0.0136] crosses zero; both neural models reliably exceed EASE. Metric choice therefore changes the top model, while the nearly overlapping Hit Ratio curves offer little separation.</w:t>
       </w:r>
     </w:p>
     <w:p>
@@ -2094,7 +2061,7 @@
         <w:rPr>
           <w:rFonts w:ascii="Arial" w:hAnsi="Arial" w:eastAsia="Arial" w:cs="Arial"/>
         </w:rPr>
-        <w:t>On Amazon, EASE leads NDCG@10 (0.0415), followed by CDAE (0.0400) and Multi-VAE (0.0383). CDAE is 3.65% below EASE and 4.45% above Multi-VAE using unrounded scores. However, all paired-bootstrap intervals cross zero: EASE-CDAE [-0.0072, 0.0100], EASE-Multi-VAE [-0.0050, 0.0117] and CDAE-Multi-VAE [-0.0074, 0.0109]. These data support no reliable pairwise winner on Amazon despite the descriptive ordering.</w:t>
+        <w:t>On Amazon, EASE leads NDCG@10 (0.0415), followed by CDAE (0.0400) and Multi-VAE (0.0383). Yet all paired 95% intervals cross zero: EASE-CDAE [-0.0072, 0.0100], EASE-Multi-VAE [-0.0050, 0.0117] and CDAE-Multi-VAE [-0.0074, 0.0109]. Thus no pairwise winner is reliable on this cohort.</w:t>
       </w:r>
     </w:p>
     <w:p>
@@ -2105,18 +2072,7 @@
         <w:rPr>
           <w:rFonts w:ascii="Arial" w:hAnsi="Arial" w:eastAsia="Arial" w:cs="Arial"/>
         </w:rPr>
-        <w:t>After 10filter, Amazon averages 11.4 interactions per user, versus 165.3 on ML-1M. Very short histories may weaken Multi-VAE's inference of a KL-regularized latent distribution and make both neural models tuning-sensitive, while EASE directly exploits item co-occurrence. These are plausible mechanisms, not causal claims, because domain, scale, sparsity and temporal coverage all change together.</w:t>
-      </w:r>
-    </w:p>
-    <w:p>
-      <w:pPr>
-        <w:spacing w:after="60" w:line="240" w:lineRule="auto"/>
-      </w:pPr>
-      <w:r>
-        <w:rPr>
-          <w:rFonts w:ascii="Arial" w:hAnsi="Arial" w:eastAsia="Arial" w:cs="Arial"/>
-        </w:rPr>
-        <w:t>Limitations are one temporal split, one seed, 20 trials, residual boundary optima and warm-start-only scope. Full ranking avoids sampled-candidate bias [7], but evaluation retains only 1,152/6,040 (19.1%) ML-1M users and 1,294/5,729 (22.6%) Amazon users after requiring train-seen users/items. The results therefore do not represent cold-start users. Future work should repeat seeds, expand targeted ranges and evaluate models designed for cold start.</w:t>
+        <w:t>Amazon averages 11.4 interactions per user versus 165.3 on ML-1M; short histories may weaken KL-regularized Multi-VAE and increase neural tuning sensitivity, while EASE uses direct co-occurrence. This is explanatory rather than causal because the datasets differ on several dimensions. Limitations are one split/seed, 20 trials, boundary optima and warm-start scope: only 1,152/6,040 (19.1%) ML-1M and 1,294/5,729 (22.6%) Amazon users are evaluated. Full ranking avoids sampled-candidate bias [7], but cold-start performance remains unknown.</w:t>
       </w:r>
     </w:p>
     <w:p>

</xml_diff>